<commit_message>
Final update - added SHAP, LIME, attention, error analysis and report
</commit_message>
<xml_diff>
--- a/NLP-A4-Report.docx
+++ b/NLP-A4-Report.docx
@@ -41,7 +41,6 @@
           <w:bCs/>
           <w:sz w:val="32"/>
           <w:szCs w:val="32"/>
-          <w:lang/>
         </w:rPr>
       </w:pPr>
       <w:r>
@@ -50,7 +49,6 @@
           <w:bCs/>
           <w:sz w:val="32"/>
           <w:szCs w:val="32"/>
-          <w:lang/>
         </w:rPr>
         <w:t>1. Introduction</w:t>
       </w:r>
@@ -60,14 +58,12 @@
         <w:rPr>
           <w:sz w:val="24"/>
           <w:szCs w:val="24"/>
-          <w:lang/>
-        </w:rPr>
-      </w:pPr>
-      <w:r>
-        <w:rPr>
-          <w:sz w:val="24"/>
-          <w:szCs w:val="24"/>
-          <w:lang/>
+        </w:rPr>
+      </w:pPr>
+      <w:r>
+        <w:rPr>
+          <w:sz w:val="24"/>
+          <w:szCs w:val="24"/>
         </w:rPr>
         <w:t>Natural Language Processing (NLP) has significantly evolved with the introduction of Transformer-based models such as BERT. These models capture contextual relationships in text using attention mechanisms, enabling superior performance in tasks like sentiment classification.</w:t>
       </w:r>
@@ -77,14 +73,12 @@
         <w:rPr>
           <w:sz w:val="24"/>
           <w:szCs w:val="24"/>
-          <w:lang/>
-        </w:rPr>
-      </w:pPr>
-      <w:r>
-        <w:rPr>
-          <w:sz w:val="24"/>
-          <w:szCs w:val="24"/>
-          <w:lang/>
+        </w:rPr>
+      </w:pPr>
+      <w:r>
+        <w:rPr>
+          <w:sz w:val="24"/>
+          <w:szCs w:val="24"/>
         </w:rPr>
         <w:t>In this project, we implement a Transformer-based sentiment classifier using the Amazon Polarity dataset. In addition to model performance, we focus on interpretability using attention visualization, SHAP, and LIME.</w:t>
       </w:r>
@@ -94,7 +88,6 @@
         <w:rPr>
           <w:sz w:val="24"/>
           <w:szCs w:val="24"/>
-          <w:lang/>
         </w:rPr>
       </w:pPr>
     </w:p>
@@ -105,7 +98,6 @@
           <w:bCs/>
           <w:sz w:val="36"/>
           <w:szCs w:val="36"/>
-          <w:lang/>
         </w:rPr>
       </w:pPr>
       <w:r>
@@ -114,7 +106,6 @@
           <w:bCs/>
           <w:sz w:val="36"/>
           <w:szCs w:val="36"/>
-          <w:lang/>
         </w:rPr>
         <w:t>2. Dataset</w:t>
       </w:r>
@@ -124,14 +115,12 @@
         <w:rPr>
           <w:sz w:val="24"/>
           <w:szCs w:val="24"/>
-          <w:lang/>
-        </w:rPr>
-      </w:pPr>
-      <w:r>
-        <w:rPr>
-          <w:sz w:val="24"/>
-          <w:szCs w:val="24"/>
-          <w:lang/>
+        </w:rPr>
+      </w:pPr>
+      <w:r>
+        <w:rPr>
+          <w:sz w:val="24"/>
+          <w:szCs w:val="24"/>
         </w:rPr>
         <w:t xml:space="preserve">We used the </w:t>
       </w:r>
@@ -141,7 +130,6 @@
           <w:bCs/>
           <w:sz w:val="24"/>
           <w:szCs w:val="24"/>
-          <w:lang/>
         </w:rPr>
         <w:t>Amazon Polarity dataset</w:t>
       </w:r>
@@ -149,7 +137,6 @@
         <w:rPr>
           <w:sz w:val="24"/>
           <w:szCs w:val="24"/>
-          <w:lang/>
         </w:rPr>
         <w:t xml:space="preserve"> from Hugging Face, which contains product reviews labeled as positive or negative.</w:t>
       </w:r>
@@ -163,14 +150,12 @@
         <w:rPr>
           <w:sz w:val="24"/>
           <w:szCs w:val="24"/>
-          <w:lang/>
-        </w:rPr>
-      </w:pPr>
-      <w:r>
-        <w:rPr>
-          <w:sz w:val="24"/>
-          <w:szCs w:val="24"/>
-          <w:lang/>
+        </w:rPr>
+      </w:pPr>
+      <w:r>
+        <w:rPr>
+          <w:sz w:val="24"/>
+          <w:szCs w:val="24"/>
         </w:rPr>
         <w:t xml:space="preserve">Total dataset: Large-scale (millions of samples) </w:t>
       </w:r>
@@ -184,14 +169,12 @@
         <w:rPr>
           <w:sz w:val="24"/>
           <w:szCs w:val="24"/>
-          <w:lang/>
-        </w:rPr>
-      </w:pPr>
-      <w:r>
-        <w:rPr>
-          <w:sz w:val="24"/>
-          <w:szCs w:val="24"/>
-          <w:lang/>
+        </w:rPr>
+      </w:pPr>
+      <w:r>
+        <w:rPr>
+          <w:sz w:val="24"/>
+          <w:szCs w:val="24"/>
         </w:rPr>
         <w:t xml:space="preserve">Used subset: </w:t>
       </w:r>
@@ -205,14 +188,12 @@
         <w:rPr>
           <w:sz w:val="24"/>
           <w:szCs w:val="24"/>
-          <w:lang/>
-        </w:rPr>
-      </w:pPr>
-      <w:r>
-        <w:rPr>
-          <w:sz w:val="24"/>
-          <w:szCs w:val="24"/>
-          <w:lang/>
+        </w:rPr>
+      </w:pPr>
+      <w:r>
+        <w:rPr>
+          <w:sz w:val="24"/>
+          <w:szCs w:val="24"/>
         </w:rPr>
         <w:t xml:space="preserve">Training: 5000 samples </w:t>
       </w:r>
@@ -226,14 +207,12 @@
         <w:rPr>
           <w:sz w:val="24"/>
           <w:szCs w:val="24"/>
-          <w:lang/>
-        </w:rPr>
-      </w:pPr>
-      <w:r>
-        <w:rPr>
-          <w:sz w:val="24"/>
-          <w:szCs w:val="24"/>
-          <w:lang/>
+        </w:rPr>
+      </w:pPr>
+      <w:r>
+        <w:rPr>
+          <w:sz w:val="24"/>
+          <w:szCs w:val="24"/>
         </w:rPr>
         <w:t xml:space="preserve">Testing: 1000 samples </w:t>
       </w:r>
@@ -243,14 +222,12 @@
         <w:rPr>
           <w:sz w:val="24"/>
           <w:szCs w:val="24"/>
-          <w:lang/>
-        </w:rPr>
-      </w:pPr>
-      <w:r>
-        <w:rPr>
-          <w:sz w:val="24"/>
-          <w:szCs w:val="24"/>
-          <w:lang/>
+        </w:rPr>
+      </w:pPr>
+      <w:r>
+        <w:rPr>
+          <w:sz w:val="24"/>
+          <w:szCs w:val="24"/>
         </w:rPr>
         <w:t>This subset was selected due to computational constraints.</w:t>
       </w:r>
@@ -260,14 +237,13 @@
         <w:rPr>
           <w:sz w:val="24"/>
           <w:szCs w:val="24"/>
-          <w:lang/>
-        </w:rPr>
-      </w:pPr>
-      <w:r>
-        <w:rPr>
-          <w:sz w:val="24"/>
-          <w:szCs w:val="24"/>
-          <w:lang/>
+        </w:rPr>
+      </w:pPr>
+      <w:r>
+        <w:rPr>
+          <w:noProof/>
+          <w:sz w:val="24"/>
+          <w:szCs w:val="24"/>
         </w:rPr>
         <w:lastRenderedPageBreak/>
         <w:drawing>
@@ -314,7 +290,6 @@
           <w:bCs/>
           <w:sz w:val="24"/>
           <w:szCs w:val="24"/>
-          <w:lang/>
         </w:rPr>
       </w:pPr>
       <w:r>
@@ -323,7 +298,6 @@
           <w:bCs/>
           <w:sz w:val="24"/>
           <w:szCs w:val="24"/>
-          <w:lang/>
         </w:rPr>
         <w:t>3. Methodology</w:t>
       </w:r>
@@ -335,7 +309,6 @@
           <w:bCs/>
           <w:sz w:val="24"/>
           <w:szCs w:val="24"/>
-          <w:lang/>
         </w:rPr>
       </w:pPr>
       <w:r>
@@ -344,7 +317,6 @@
           <w:bCs/>
           <w:sz w:val="24"/>
           <w:szCs w:val="24"/>
-          <w:lang/>
         </w:rPr>
         <w:t>3.1 Data Preprocessing</w:t>
       </w:r>
@@ -358,14 +330,12 @@
         <w:rPr>
           <w:sz w:val="24"/>
           <w:szCs w:val="24"/>
-          <w:lang/>
-        </w:rPr>
-      </w:pPr>
-      <w:r>
-        <w:rPr>
-          <w:sz w:val="24"/>
-          <w:szCs w:val="24"/>
-          <w:lang/>
+        </w:rPr>
+      </w:pPr>
+      <w:r>
+        <w:rPr>
+          <w:sz w:val="24"/>
+          <w:szCs w:val="24"/>
         </w:rPr>
         <w:t xml:space="preserve">Loaded dataset using Hugging Face datasets </w:t>
       </w:r>
@@ -379,14 +349,12 @@
         <w:rPr>
           <w:sz w:val="24"/>
           <w:szCs w:val="24"/>
-          <w:lang/>
-        </w:rPr>
-      </w:pPr>
-      <w:r>
-        <w:rPr>
-          <w:sz w:val="24"/>
-          <w:szCs w:val="24"/>
-          <w:lang/>
+        </w:rPr>
+      </w:pPr>
+      <w:r>
+        <w:rPr>
+          <w:sz w:val="24"/>
+          <w:szCs w:val="24"/>
         </w:rPr>
         <w:t xml:space="preserve">Shuffled and selected subset </w:t>
       </w:r>
@@ -400,14 +368,12 @@
         <w:rPr>
           <w:sz w:val="24"/>
           <w:szCs w:val="24"/>
-          <w:lang/>
-        </w:rPr>
-      </w:pPr>
-      <w:r>
-        <w:rPr>
-          <w:sz w:val="24"/>
-          <w:szCs w:val="24"/>
-          <w:lang/>
+        </w:rPr>
+      </w:pPr>
+      <w:r>
+        <w:rPr>
+          <w:sz w:val="24"/>
+          <w:szCs w:val="24"/>
         </w:rPr>
         <w:t xml:space="preserve">Tokenized text using BERT tokenizer </w:t>
       </w:r>
@@ -421,14 +387,12 @@
         <w:rPr>
           <w:sz w:val="24"/>
           <w:szCs w:val="24"/>
-          <w:lang/>
-        </w:rPr>
-      </w:pPr>
-      <w:r>
-        <w:rPr>
-          <w:sz w:val="24"/>
-          <w:szCs w:val="24"/>
-          <w:lang/>
+        </w:rPr>
+      </w:pPr>
+      <w:r>
+        <w:rPr>
+          <w:sz w:val="24"/>
+          <w:szCs w:val="24"/>
         </w:rPr>
         <w:t xml:space="preserve">Applied padding and truncation </w:t>
       </w:r>
@@ -438,14 +402,13 @@
         <w:rPr>
           <w:sz w:val="24"/>
           <w:szCs w:val="24"/>
-          <w:lang/>
-        </w:rPr>
-      </w:pPr>
-      <w:r>
-        <w:rPr>
-          <w:sz w:val="24"/>
-          <w:szCs w:val="24"/>
-          <w:lang/>
+        </w:rPr>
+      </w:pPr>
+      <w:r>
+        <w:rPr>
+          <w:noProof/>
+          <w:sz w:val="24"/>
+          <w:szCs w:val="24"/>
         </w:rPr>
         <w:drawing>
           <wp:inline distT="0" distB="0" distL="0" distR="0" wp14:anchorId="3CA63B1B" wp14:editId="3092A4E7">
@@ -485,9 +448,9 @@
       </w:r>
       <w:r>
         <w:rPr>
-          <w:sz w:val="24"/>
-          <w:szCs w:val="24"/>
-          <w:lang/>
+          <w:noProof/>
+          <w:sz w:val="24"/>
+          <w:szCs w:val="24"/>
         </w:rPr>
         <w:drawing>
           <wp:inline distT="0" distB="0" distL="0" distR="0" wp14:anchorId="56D183D0" wp14:editId="712391AC">
@@ -533,7 +496,6 @@
           <w:bCs/>
           <w:sz w:val="24"/>
           <w:szCs w:val="24"/>
-          <w:lang/>
         </w:rPr>
       </w:pPr>
       <w:r>
@@ -542,7 +504,6 @@
           <w:bCs/>
           <w:sz w:val="24"/>
           <w:szCs w:val="24"/>
-          <w:lang/>
         </w:rPr>
         <w:t>3.2 Model</w:t>
       </w:r>
@@ -552,14 +513,12 @@
         <w:rPr>
           <w:sz w:val="24"/>
           <w:szCs w:val="24"/>
-          <w:lang/>
-        </w:rPr>
-      </w:pPr>
-      <w:r>
-        <w:rPr>
-          <w:sz w:val="24"/>
-          <w:szCs w:val="24"/>
-          <w:lang/>
+        </w:rPr>
+      </w:pPr>
+      <w:r>
+        <w:rPr>
+          <w:sz w:val="24"/>
+          <w:szCs w:val="24"/>
         </w:rPr>
         <w:t>We used:</w:t>
       </w:r>
@@ -573,14 +532,12 @@
         <w:rPr>
           <w:sz w:val="24"/>
           <w:szCs w:val="24"/>
-          <w:lang/>
-        </w:rPr>
-      </w:pPr>
-      <w:r>
-        <w:rPr>
-          <w:sz w:val="24"/>
-          <w:szCs w:val="24"/>
-          <w:lang/>
+        </w:rPr>
+      </w:pPr>
+      <w:r>
+        <w:rPr>
+          <w:sz w:val="24"/>
+          <w:szCs w:val="24"/>
         </w:rPr>
         <w:lastRenderedPageBreak/>
         <w:t xml:space="preserve">Model: BERT (bert-base-uncased) </w:t>
@@ -595,14 +552,12 @@
         <w:rPr>
           <w:sz w:val="24"/>
           <w:szCs w:val="24"/>
-          <w:lang/>
-        </w:rPr>
-      </w:pPr>
-      <w:r>
-        <w:rPr>
-          <w:sz w:val="24"/>
-          <w:szCs w:val="24"/>
-          <w:lang/>
+        </w:rPr>
+      </w:pPr>
+      <w:r>
+        <w:rPr>
+          <w:sz w:val="24"/>
+          <w:szCs w:val="24"/>
         </w:rPr>
         <w:t xml:space="preserve">Task: Binary classification </w:t>
       </w:r>
@@ -616,14 +571,12 @@
         <w:rPr>
           <w:sz w:val="24"/>
           <w:szCs w:val="24"/>
-          <w:lang/>
-        </w:rPr>
-      </w:pPr>
-      <w:r>
-        <w:rPr>
-          <w:sz w:val="24"/>
-          <w:szCs w:val="24"/>
-          <w:lang/>
+        </w:rPr>
+      </w:pPr>
+      <w:r>
+        <w:rPr>
+          <w:sz w:val="24"/>
+          <w:szCs w:val="24"/>
         </w:rPr>
         <w:t xml:space="preserve">Output: Positive / Negative sentiment </w:t>
       </w:r>
@@ -633,14 +586,13 @@
         <w:rPr>
           <w:sz w:val="24"/>
           <w:szCs w:val="24"/>
-          <w:lang/>
-        </w:rPr>
-      </w:pPr>
-      <w:r>
-        <w:rPr>
-          <w:sz w:val="24"/>
-          <w:szCs w:val="24"/>
-          <w:lang/>
+        </w:rPr>
+      </w:pPr>
+      <w:r>
+        <w:rPr>
+          <w:noProof/>
+          <w:sz w:val="24"/>
+          <w:szCs w:val="24"/>
         </w:rPr>
         <w:drawing>
           <wp:inline distT="0" distB="0" distL="0" distR="0" wp14:anchorId="4FC37A07" wp14:editId="081B9531">
@@ -686,7 +638,6 @@
           <w:bCs/>
           <w:sz w:val="24"/>
           <w:szCs w:val="24"/>
-          <w:lang/>
         </w:rPr>
       </w:pPr>
       <w:r>
@@ -695,7 +646,6 @@
           <w:bCs/>
           <w:sz w:val="24"/>
           <w:szCs w:val="24"/>
-          <w:lang/>
         </w:rPr>
         <w:t>3.3 Training Setup</w:t>
       </w:r>
@@ -709,14 +659,12 @@
         <w:rPr>
           <w:sz w:val="24"/>
           <w:szCs w:val="24"/>
-          <w:lang/>
-        </w:rPr>
-      </w:pPr>
-      <w:r>
-        <w:rPr>
-          <w:sz w:val="24"/>
-          <w:szCs w:val="24"/>
-          <w:lang/>
+        </w:rPr>
+      </w:pPr>
+      <w:r>
+        <w:rPr>
+          <w:sz w:val="24"/>
+          <w:szCs w:val="24"/>
         </w:rPr>
         <w:t xml:space="preserve">Epochs: 2 </w:t>
       </w:r>
@@ -730,14 +678,12 @@
         <w:rPr>
           <w:sz w:val="24"/>
           <w:szCs w:val="24"/>
-          <w:lang/>
-        </w:rPr>
-      </w:pPr>
-      <w:r>
-        <w:rPr>
-          <w:sz w:val="24"/>
-          <w:szCs w:val="24"/>
-          <w:lang/>
+        </w:rPr>
+      </w:pPr>
+      <w:r>
+        <w:rPr>
+          <w:sz w:val="24"/>
+          <w:szCs w:val="24"/>
         </w:rPr>
         <w:t xml:space="preserve">Batch size: 8 </w:t>
       </w:r>
@@ -751,14 +697,12 @@
         <w:rPr>
           <w:sz w:val="24"/>
           <w:szCs w:val="24"/>
-          <w:lang/>
-        </w:rPr>
-      </w:pPr>
-      <w:r>
-        <w:rPr>
-          <w:sz w:val="24"/>
-          <w:szCs w:val="24"/>
-          <w:lang/>
+        </w:rPr>
+      </w:pPr>
+      <w:r>
+        <w:rPr>
+          <w:sz w:val="24"/>
+          <w:szCs w:val="24"/>
         </w:rPr>
         <w:t xml:space="preserve">Optimizer: AdamW (default in Trainer) </w:t>
       </w:r>
@@ -772,14 +716,12 @@
         <w:rPr>
           <w:sz w:val="24"/>
           <w:szCs w:val="24"/>
-          <w:lang/>
-        </w:rPr>
-      </w:pPr>
-      <w:r>
-        <w:rPr>
-          <w:sz w:val="24"/>
-          <w:szCs w:val="24"/>
-          <w:lang/>
+        </w:rPr>
+      </w:pPr>
+      <w:r>
+        <w:rPr>
+          <w:sz w:val="24"/>
+          <w:szCs w:val="24"/>
         </w:rPr>
         <w:t xml:space="preserve">Evaluation strategy: Per epoch </w:t>
       </w:r>
@@ -789,14 +731,13 @@
         <w:rPr>
           <w:sz w:val="24"/>
           <w:szCs w:val="24"/>
-          <w:lang/>
-        </w:rPr>
-      </w:pPr>
-      <w:r>
-        <w:rPr>
-          <w:sz w:val="24"/>
-          <w:szCs w:val="24"/>
-          <w:lang/>
+        </w:rPr>
+      </w:pPr>
+      <w:r>
+        <w:rPr>
+          <w:noProof/>
+          <w:sz w:val="24"/>
+          <w:szCs w:val="24"/>
         </w:rPr>
         <w:drawing>
           <wp:inline distT="0" distB="0" distL="0" distR="0" wp14:anchorId="213572DB" wp14:editId="2FAB34F2">
@@ -842,7 +783,6 @@
           <w:bCs/>
           <w:sz w:val="24"/>
           <w:szCs w:val="24"/>
-          <w:lang/>
         </w:rPr>
       </w:pPr>
       <w:r>
@@ -851,7 +791,6 @@
           <w:bCs/>
           <w:sz w:val="24"/>
           <w:szCs w:val="24"/>
-          <w:lang/>
         </w:rPr>
         <w:t>3.4 Evaluation Metrics</w:t>
       </w:r>
@@ -861,14 +800,12 @@
         <w:rPr>
           <w:sz w:val="24"/>
           <w:szCs w:val="24"/>
-          <w:lang/>
-        </w:rPr>
-      </w:pPr>
-      <w:r>
-        <w:rPr>
-          <w:sz w:val="24"/>
-          <w:szCs w:val="24"/>
-          <w:lang/>
+        </w:rPr>
+      </w:pPr>
+      <w:r>
+        <w:rPr>
+          <w:sz w:val="24"/>
+          <w:szCs w:val="24"/>
         </w:rPr>
         <w:t>We evaluated the model using:</w:t>
       </w:r>
@@ -882,14 +819,12 @@
         <w:rPr>
           <w:sz w:val="24"/>
           <w:szCs w:val="24"/>
-          <w:lang/>
-        </w:rPr>
-      </w:pPr>
-      <w:r>
-        <w:rPr>
-          <w:sz w:val="24"/>
-          <w:szCs w:val="24"/>
-          <w:lang/>
+        </w:rPr>
+      </w:pPr>
+      <w:r>
+        <w:rPr>
+          <w:sz w:val="24"/>
+          <w:szCs w:val="24"/>
         </w:rPr>
         <w:t xml:space="preserve">Accuracy </w:t>
       </w:r>
@@ -903,14 +838,12 @@
         <w:rPr>
           <w:sz w:val="24"/>
           <w:szCs w:val="24"/>
-          <w:lang/>
-        </w:rPr>
-      </w:pPr>
-      <w:r>
-        <w:rPr>
-          <w:sz w:val="24"/>
-          <w:szCs w:val="24"/>
-          <w:lang/>
+        </w:rPr>
+      </w:pPr>
+      <w:r>
+        <w:rPr>
+          <w:sz w:val="24"/>
+          <w:szCs w:val="24"/>
         </w:rPr>
         <w:t xml:space="preserve">Precision </w:t>
       </w:r>
@@ -924,14 +857,12 @@
         <w:rPr>
           <w:sz w:val="24"/>
           <w:szCs w:val="24"/>
-          <w:lang/>
-        </w:rPr>
-      </w:pPr>
-      <w:r>
-        <w:rPr>
-          <w:sz w:val="24"/>
-          <w:szCs w:val="24"/>
-          <w:lang/>
+        </w:rPr>
+      </w:pPr>
+      <w:r>
+        <w:rPr>
+          <w:sz w:val="24"/>
+          <w:szCs w:val="24"/>
         </w:rPr>
         <w:t xml:space="preserve">Recall </w:t>
       </w:r>
@@ -945,14 +876,12 @@
         <w:rPr>
           <w:sz w:val="24"/>
           <w:szCs w:val="24"/>
-          <w:lang/>
-        </w:rPr>
-      </w:pPr>
-      <w:r>
-        <w:rPr>
-          <w:sz w:val="24"/>
-          <w:szCs w:val="24"/>
-          <w:lang/>
+        </w:rPr>
+      </w:pPr>
+      <w:r>
+        <w:rPr>
+          <w:sz w:val="24"/>
+          <w:szCs w:val="24"/>
         </w:rPr>
         <w:t xml:space="preserve">F1-score </w:t>
       </w:r>
@@ -962,7 +891,6 @@
         <w:rPr>
           <w:sz w:val="24"/>
           <w:szCs w:val="24"/>
-          <w:lang/>
         </w:rPr>
       </w:pPr>
     </w:p>
@@ -973,7 +901,6 @@
           <w:bCs/>
           <w:sz w:val="24"/>
           <w:szCs w:val="24"/>
-          <w:lang/>
         </w:rPr>
       </w:pPr>
       <w:r>
@@ -982,7 +909,6 @@
           <w:bCs/>
           <w:sz w:val="24"/>
           <w:szCs w:val="24"/>
-          <w:lang/>
         </w:rPr>
         <w:lastRenderedPageBreak/>
         <w:t>4. Results</w:t>
@@ -993,14 +919,12 @@
         <w:rPr>
           <w:sz w:val="24"/>
           <w:szCs w:val="24"/>
-          <w:lang/>
-        </w:rPr>
-      </w:pPr>
-      <w:r>
-        <w:rPr>
-          <w:sz w:val="24"/>
-          <w:szCs w:val="24"/>
-          <w:lang/>
+        </w:rPr>
+      </w:pPr>
+      <w:r>
+        <w:rPr>
+          <w:sz w:val="24"/>
+          <w:szCs w:val="24"/>
         </w:rPr>
         <w:t>The model achieved strong performance on the test dataset:</w:t>
       </w:r>
@@ -1014,14 +938,12 @@
         <w:rPr>
           <w:sz w:val="24"/>
           <w:szCs w:val="24"/>
-          <w:lang/>
-        </w:rPr>
-      </w:pPr>
-      <w:r>
-        <w:rPr>
-          <w:sz w:val="24"/>
-          <w:szCs w:val="24"/>
-          <w:lang/>
+        </w:rPr>
+      </w:pPr>
+      <w:r>
+        <w:rPr>
+          <w:sz w:val="24"/>
+          <w:szCs w:val="24"/>
         </w:rPr>
         <w:t xml:space="preserve">Accuracy: </w:t>
       </w:r>
@@ -1029,7 +951,6 @@
         <w:rPr>
           <w:sz w:val="24"/>
           <w:szCs w:val="24"/>
-          <w:lang/>
         </w:rPr>
         <w:t>0.913</w:t>
       </w:r>
@@ -1043,14 +964,12 @@
         <w:rPr>
           <w:sz w:val="24"/>
           <w:szCs w:val="24"/>
-          <w:lang/>
-        </w:rPr>
-      </w:pPr>
-      <w:r>
-        <w:rPr>
-          <w:sz w:val="24"/>
-          <w:szCs w:val="24"/>
-          <w:lang/>
+        </w:rPr>
+      </w:pPr>
+      <w:r>
+        <w:rPr>
+          <w:sz w:val="24"/>
+          <w:szCs w:val="24"/>
         </w:rPr>
         <w:t xml:space="preserve">Precision: </w:t>
       </w:r>
@@ -1071,14 +990,12 @@
         <w:rPr>
           <w:sz w:val="24"/>
           <w:szCs w:val="24"/>
-          <w:lang/>
-        </w:rPr>
-      </w:pPr>
-      <w:r>
-        <w:rPr>
-          <w:sz w:val="24"/>
-          <w:szCs w:val="24"/>
-          <w:lang/>
+        </w:rPr>
+      </w:pPr>
+      <w:r>
+        <w:rPr>
+          <w:sz w:val="24"/>
+          <w:szCs w:val="24"/>
         </w:rPr>
         <w:t xml:space="preserve">Recall: </w:t>
       </w:r>
@@ -1099,14 +1016,12 @@
         <w:rPr>
           <w:sz w:val="24"/>
           <w:szCs w:val="24"/>
-          <w:lang/>
-        </w:rPr>
-      </w:pPr>
-      <w:r>
-        <w:rPr>
-          <w:sz w:val="24"/>
-          <w:szCs w:val="24"/>
-          <w:lang/>
+        </w:rPr>
+      </w:pPr>
+      <w:r>
+        <w:rPr>
+          <w:sz w:val="24"/>
+          <w:szCs w:val="24"/>
         </w:rPr>
         <w:t xml:space="preserve">F1-score: </w:t>
       </w:r>
@@ -1121,7 +1036,6 @@
         <w:rPr>
           <w:sz w:val="24"/>
           <w:szCs w:val="24"/>
-          <w:lang/>
         </w:rPr>
         <w:t xml:space="preserve"> </w:t>
       </w:r>
@@ -1131,14 +1045,12 @@
         <w:rPr>
           <w:sz w:val="24"/>
           <w:szCs w:val="24"/>
-          <w:lang/>
-        </w:rPr>
-      </w:pPr>
-      <w:r>
-        <w:rPr>
-          <w:sz w:val="24"/>
-          <w:szCs w:val="24"/>
-          <w:lang/>
+        </w:rPr>
+      </w:pPr>
+      <w:r>
+        <w:rPr>
+          <w:sz w:val="24"/>
+          <w:szCs w:val="24"/>
         </w:rPr>
         <w:t>This indicates that the Transformer model effectively captures sentiment patterns.</w:t>
       </w:r>
@@ -1148,7 +1060,6 @@
         <w:rPr>
           <w:sz w:val="24"/>
           <w:szCs w:val="24"/>
-          <w:lang/>
         </w:rPr>
       </w:pPr>
     </w:p>
@@ -1159,7 +1070,6 @@
           <w:bCs/>
           <w:sz w:val="24"/>
           <w:szCs w:val="24"/>
-          <w:lang/>
         </w:rPr>
       </w:pPr>
       <w:r>
@@ -1168,7 +1078,6 @@
           <w:bCs/>
           <w:sz w:val="24"/>
           <w:szCs w:val="24"/>
-          <w:lang/>
         </w:rPr>
         <w:t>5. Attention Analysis</w:t>
       </w:r>
@@ -1178,14 +1087,12 @@
         <w:rPr>
           <w:sz w:val="24"/>
           <w:szCs w:val="24"/>
-          <w:lang/>
-        </w:rPr>
-      </w:pPr>
-      <w:r>
-        <w:rPr>
-          <w:sz w:val="24"/>
-          <w:szCs w:val="24"/>
-          <w:lang/>
+        </w:rPr>
+      </w:pPr>
+      <w:r>
+        <w:rPr>
+          <w:sz w:val="24"/>
+          <w:szCs w:val="24"/>
         </w:rPr>
         <w:t>Transformer models use attention mechanisms to focus on important words.</w:t>
       </w:r>
@@ -1195,14 +1102,12 @@
         <w:rPr>
           <w:sz w:val="24"/>
           <w:szCs w:val="24"/>
-          <w:lang/>
-        </w:rPr>
-      </w:pPr>
-      <w:r>
-        <w:rPr>
-          <w:sz w:val="24"/>
-          <w:szCs w:val="24"/>
-          <w:lang/>
+        </w:rPr>
+      </w:pPr>
+      <w:r>
+        <w:rPr>
+          <w:sz w:val="24"/>
+          <w:szCs w:val="24"/>
         </w:rPr>
         <w:t>We extracted attention weights from multiple layers and heads and visualized them as heatmaps.</w:t>
       </w:r>
@@ -1214,7 +1119,6 @@
           <w:bCs/>
           <w:sz w:val="24"/>
           <w:szCs w:val="24"/>
-          <w:lang/>
         </w:rPr>
       </w:pPr>
       <w:r>
@@ -1223,7 +1127,6 @@
           <w:bCs/>
           <w:sz w:val="24"/>
           <w:szCs w:val="24"/>
-          <w:lang/>
         </w:rPr>
         <w:t>Observations:</w:t>
       </w:r>
@@ -1237,14 +1140,12 @@
         <w:rPr>
           <w:sz w:val="24"/>
           <w:szCs w:val="24"/>
-          <w:lang/>
-        </w:rPr>
-      </w:pPr>
-      <w:r>
-        <w:rPr>
-          <w:sz w:val="24"/>
-          <w:szCs w:val="24"/>
-          <w:lang/>
+        </w:rPr>
+      </w:pPr>
+      <w:r>
+        <w:rPr>
+          <w:sz w:val="24"/>
+          <w:szCs w:val="24"/>
         </w:rPr>
         <w:t xml:space="preserve">Words like </w:t>
       </w:r>
@@ -1254,7 +1155,6 @@
           <w:iCs/>
           <w:sz w:val="24"/>
           <w:szCs w:val="24"/>
-          <w:lang/>
         </w:rPr>
         <w:t>great</w:t>
       </w:r>
@@ -1262,7 +1162,6 @@
         <w:rPr>
           <w:sz w:val="24"/>
           <w:szCs w:val="24"/>
-          <w:lang/>
         </w:rPr>
         <w:t xml:space="preserve">, </w:t>
       </w:r>
@@ -1272,7 +1171,6 @@
           <w:iCs/>
           <w:sz w:val="24"/>
           <w:szCs w:val="24"/>
-          <w:lang/>
         </w:rPr>
         <w:t>bad</w:t>
       </w:r>
@@ -1280,7 +1178,6 @@
         <w:rPr>
           <w:sz w:val="24"/>
           <w:szCs w:val="24"/>
-          <w:lang/>
         </w:rPr>
         <w:t xml:space="preserve">, </w:t>
       </w:r>
@@ -1290,7 +1187,6 @@
           <w:iCs/>
           <w:sz w:val="24"/>
           <w:szCs w:val="24"/>
-          <w:lang/>
         </w:rPr>
         <w:t>excellent</w:t>
       </w:r>
@@ -1298,7 +1194,6 @@
         <w:rPr>
           <w:sz w:val="24"/>
           <w:szCs w:val="24"/>
-          <w:lang/>
         </w:rPr>
         <w:t xml:space="preserve"> receive high attention </w:t>
       </w:r>
@@ -1312,14 +1207,12 @@
         <w:rPr>
           <w:sz w:val="24"/>
           <w:szCs w:val="24"/>
-          <w:lang/>
-        </w:rPr>
-      </w:pPr>
-      <w:r>
-        <w:rPr>
-          <w:sz w:val="24"/>
-          <w:szCs w:val="24"/>
-          <w:lang/>
+        </w:rPr>
+      </w:pPr>
+      <w:r>
+        <w:rPr>
+          <w:sz w:val="24"/>
+          <w:szCs w:val="24"/>
         </w:rPr>
         <w:t xml:space="preserve">Attention captures relationships between key tokens </w:t>
       </w:r>
@@ -1333,14 +1226,12 @@
         <w:rPr>
           <w:sz w:val="24"/>
           <w:szCs w:val="24"/>
-          <w:lang/>
-        </w:rPr>
-      </w:pPr>
-      <w:r>
-        <w:rPr>
-          <w:sz w:val="24"/>
-          <w:szCs w:val="24"/>
-          <w:lang/>
+        </w:rPr>
+      </w:pPr>
+      <w:r>
+        <w:rPr>
+          <w:sz w:val="24"/>
+          <w:szCs w:val="24"/>
         </w:rPr>
         <w:t xml:space="preserve">Different heads focus on different patterns </w:t>
       </w:r>
@@ -1350,7 +1241,6 @@
         <w:rPr>
           <w:sz w:val="24"/>
           <w:szCs w:val="24"/>
-          <w:lang/>
         </w:rPr>
       </w:pPr>
       <w:r>
@@ -1493,7 +1383,6 @@
           <w:bCs/>
           <w:sz w:val="24"/>
           <w:szCs w:val="24"/>
-          <w:lang/>
         </w:rPr>
       </w:pPr>
       <w:r>
@@ -1502,7 +1391,6 @@
           <w:bCs/>
           <w:sz w:val="24"/>
           <w:szCs w:val="24"/>
-          <w:lang/>
         </w:rPr>
         <w:t>6. SHAP Explainability</w:t>
       </w:r>
@@ -1512,14 +1400,12 @@
         <w:rPr>
           <w:sz w:val="24"/>
           <w:szCs w:val="24"/>
-          <w:lang/>
-        </w:rPr>
-      </w:pPr>
-      <w:r>
-        <w:rPr>
-          <w:sz w:val="24"/>
-          <w:szCs w:val="24"/>
-          <w:lang/>
+        </w:rPr>
+      </w:pPr>
+      <w:r>
+        <w:rPr>
+          <w:sz w:val="24"/>
+          <w:szCs w:val="24"/>
         </w:rPr>
         <w:t>SHAP (SHapley Additive exPlanations) was used to explain model predictions.</w:t>
       </w:r>
@@ -1531,7 +1417,6 @@
           <w:bCs/>
           <w:sz w:val="24"/>
           <w:szCs w:val="24"/>
-          <w:lang/>
         </w:rPr>
       </w:pPr>
       <w:r>
@@ -1540,7 +1425,6 @@
           <w:bCs/>
           <w:sz w:val="24"/>
           <w:szCs w:val="24"/>
-          <w:lang/>
         </w:rPr>
         <w:t>Observations:</w:t>
       </w:r>
@@ -1554,14 +1438,12 @@
         <w:rPr>
           <w:sz w:val="24"/>
           <w:szCs w:val="24"/>
-          <w:lang/>
-        </w:rPr>
-      </w:pPr>
-      <w:r>
-        <w:rPr>
-          <w:sz w:val="24"/>
-          <w:szCs w:val="24"/>
-          <w:lang/>
+        </w:rPr>
+      </w:pPr>
+      <w:r>
+        <w:rPr>
+          <w:sz w:val="24"/>
+          <w:szCs w:val="24"/>
         </w:rPr>
         <w:t xml:space="preserve">SHAP highlights word contributions </w:t>
       </w:r>
@@ -1575,14 +1457,12 @@
         <w:rPr>
           <w:sz w:val="24"/>
           <w:szCs w:val="24"/>
-          <w:lang/>
-        </w:rPr>
-      </w:pPr>
-      <w:r>
-        <w:rPr>
-          <w:sz w:val="24"/>
-          <w:szCs w:val="24"/>
-          <w:lang/>
+        </w:rPr>
+      </w:pPr>
+      <w:r>
+        <w:rPr>
+          <w:sz w:val="24"/>
+          <w:szCs w:val="24"/>
         </w:rPr>
         <w:t xml:space="preserve">Positive words → positive contribution (red) </w:t>
       </w:r>
@@ -1596,14 +1476,12 @@
         <w:rPr>
           <w:sz w:val="24"/>
           <w:szCs w:val="24"/>
-          <w:lang/>
-        </w:rPr>
-      </w:pPr>
-      <w:r>
-        <w:rPr>
-          <w:sz w:val="24"/>
-          <w:szCs w:val="24"/>
-          <w:lang/>
+        </w:rPr>
+      </w:pPr>
+      <w:r>
+        <w:rPr>
+          <w:sz w:val="24"/>
+          <w:szCs w:val="24"/>
         </w:rPr>
         <w:t xml:space="preserve">Negative words → negative contribution (blue) </w:t>
       </w:r>
@@ -1617,14 +1495,12 @@
         <w:rPr>
           <w:sz w:val="24"/>
           <w:szCs w:val="24"/>
-          <w:lang/>
-        </w:rPr>
-      </w:pPr>
-      <w:r>
-        <w:rPr>
-          <w:sz w:val="24"/>
-          <w:szCs w:val="24"/>
-          <w:lang/>
+        </w:rPr>
+      </w:pPr>
+      <w:r>
+        <w:rPr>
+          <w:sz w:val="24"/>
+          <w:szCs w:val="24"/>
         </w:rPr>
         <w:lastRenderedPageBreak/>
         <w:t xml:space="preserve">Provides consistent and reliable explanations </w:t>
@@ -1635,14 +1511,13 @@
         <w:rPr>
           <w:sz w:val="24"/>
           <w:szCs w:val="24"/>
-          <w:lang/>
-        </w:rPr>
-      </w:pPr>
-      <w:r>
-        <w:rPr>
-          <w:sz w:val="24"/>
-          <w:szCs w:val="24"/>
-          <w:lang/>
+        </w:rPr>
+      </w:pPr>
+      <w:r>
+        <w:rPr>
+          <w:noProof/>
+          <w:sz w:val="24"/>
+          <w:szCs w:val="24"/>
         </w:rPr>
         <w:drawing>
           <wp:inline distT="0" distB="0" distL="0" distR="0" wp14:anchorId="2378764D" wp14:editId="2485DAAF">
@@ -1688,7 +1563,6 @@
           <w:bCs/>
           <w:sz w:val="24"/>
           <w:szCs w:val="24"/>
-          <w:lang/>
         </w:rPr>
       </w:pPr>
       <w:r>
@@ -1697,7 +1571,6 @@
           <w:bCs/>
           <w:sz w:val="24"/>
           <w:szCs w:val="24"/>
-          <w:lang/>
         </w:rPr>
         <w:t>7. LIME Explainability</w:t>
       </w:r>
@@ -1707,14 +1580,12 @@
         <w:rPr>
           <w:sz w:val="24"/>
           <w:szCs w:val="24"/>
-          <w:lang/>
-        </w:rPr>
-      </w:pPr>
-      <w:r>
-        <w:rPr>
-          <w:sz w:val="24"/>
-          <w:szCs w:val="24"/>
-          <w:lang/>
+        </w:rPr>
+      </w:pPr>
+      <w:r>
+        <w:rPr>
+          <w:sz w:val="24"/>
+          <w:szCs w:val="24"/>
         </w:rPr>
         <w:t>LIME explains predictions locally for individual samples.</w:t>
       </w:r>
@@ -1726,7 +1597,6 @@
           <w:bCs/>
           <w:sz w:val="24"/>
           <w:szCs w:val="24"/>
-          <w:lang/>
         </w:rPr>
       </w:pPr>
       <w:r>
@@ -1735,7 +1605,6 @@
           <w:bCs/>
           <w:sz w:val="24"/>
           <w:szCs w:val="24"/>
-          <w:lang/>
         </w:rPr>
         <w:t>Observations:</w:t>
       </w:r>
@@ -1749,14 +1618,12 @@
         <w:rPr>
           <w:sz w:val="24"/>
           <w:szCs w:val="24"/>
-          <w:lang/>
-        </w:rPr>
-      </w:pPr>
-      <w:r>
-        <w:rPr>
-          <w:sz w:val="24"/>
-          <w:szCs w:val="24"/>
-          <w:lang/>
+        </w:rPr>
+      </w:pPr>
+      <w:r>
+        <w:rPr>
+          <w:sz w:val="24"/>
+          <w:szCs w:val="24"/>
         </w:rPr>
         <w:t xml:space="preserve">Shows important words influencing prediction </w:t>
       </w:r>
@@ -1770,14 +1637,12 @@
         <w:rPr>
           <w:sz w:val="24"/>
           <w:szCs w:val="24"/>
-          <w:lang/>
-        </w:rPr>
-      </w:pPr>
-      <w:r>
-        <w:rPr>
-          <w:sz w:val="24"/>
-          <w:szCs w:val="24"/>
-          <w:lang/>
+        </w:rPr>
+      </w:pPr>
+      <w:r>
+        <w:rPr>
+          <w:sz w:val="24"/>
+          <w:szCs w:val="24"/>
         </w:rPr>
         <w:t xml:space="preserve">Faster than SHAP </w:t>
       </w:r>
@@ -1791,14 +1656,12 @@
         <w:rPr>
           <w:sz w:val="24"/>
           <w:szCs w:val="24"/>
-          <w:lang/>
-        </w:rPr>
-      </w:pPr>
-      <w:r>
-        <w:rPr>
-          <w:sz w:val="24"/>
-          <w:szCs w:val="24"/>
-          <w:lang/>
+        </w:rPr>
+      </w:pPr>
+      <w:r>
+        <w:rPr>
+          <w:sz w:val="24"/>
+          <w:szCs w:val="24"/>
         </w:rPr>
         <w:t xml:space="preserve">Less stable across runs </w:t>
       </w:r>
@@ -1810,6 +1673,47 @@
           <w:szCs w:val="24"/>
         </w:rPr>
       </w:pPr>
+      <w:r>
+        <w:rPr>
+          <w:sz w:val="24"/>
+          <w:szCs w:val="24"/>
+        </w:rPr>
+        <w:drawing>
+          <wp:inline distT="0" distB="0" distL="0" distR="0" wp14:anchorId="37294246" wp14:editId="52BB3B54">
+            <wp:extent cx="5977454" cy="2354580"/>
+            <wp:effectExtent l="0" t="0" r="4445" b="7620"/>
+            <wp:docPr id="2042973590" name="Picture 1"/>
+            <wp:cNvGraphicFramePr>
+              <a:graphicFrameLocks xmlns:a="http://schemas.openxmlformats.org/drawingml/2006/main" noChangeAspect="1"/>
+            </wp:cNvGraphicFramePr>
+            <a:graphic xmlns:a="http://schemas.openxmlformats.org/drawingml/2006/main">
+              <a:graphicData uri="http://schemas.openxmlformats.org/drawingml/2006/picture">
+                <pic:pic xmlns:pic="http://schemas.openxmlformats.org/drawingml/2006/picture">
+                  <pic:nvPicPr>
+                    <pic:cNvPr id="2042973590" name=""/>
+                    <pic:cNvPicPr/>
+                  </pic:nvPicPr>
+                  <pic:blipFill>
+                    <a:blip r:embed="rId13"/>
+                    <a:stretch>
+                      <a:fillRect/>
+                    </a:stretch>
+                  </pic:blipFill>
+                  <pic:spPr>
+                    <a:xfrm>
+                      <a:off x="0" y="0"/>
+                      <a:ext cx="5979998" cy="2355582"/>
+                    </a:xfrm>
+                    <a:prstGeom prst="rect">
+                      <a:avLst/>
+                    </a:prstGeom>
+                  </pic:spPr>
+                </pic:pic>
+              </a:graphicData>
+            </a:graphic>
+          </wp:inline>
+        </w:drawing>
+      </w:r>
     </w:p>
     <w:p>
       <w:pPr>
@@ -1861,7 +1765,6 @@
                 <w:bCs/>
                 <w:sz w:val="24"/>
                 <w:szCs w:val="24"/>
-                <w:lang/>
               </w:rPr>
             </w:pPr>
             <w:r>
@@ -1870,7 +1773,6 @@
                 <w:bCs/>
                 <w:sz w:val="24"/>
                 <w:szCs w:val="24"/>
-                <w:lang/>
               </w:rPr>
               <w:t>Aspect</w:t>
             </w:r>
@@ -1889,7 +1791,6 @@
                 <w:bCs/>
                 <w:sz w:val="24"/>
                 <w:szCs w:val="24"/>
-                <w:lang/>
               </w:rPr>
             </w:pPr>
             <w:r>
@@ -1898,7 +1799,6 @@
                 <w:bCs/>
                 <w:sz w:val="24"/>
                 <w:szCs w:val="24"/>
-                <w:lang/>
               </w:rPr>
               <w:t>SHAP</w:t>
             </w:r>
@@ -1917,7 +1817,6 @@
                 <w:bCs/>
                 <w:sz w:val="24"/>
                 <w:szCs w:val="24"/>
-                <w:lang/>
               </w:rPr>
             </w:pPr>
             <w:r>
@@ -1926,7 +1825,6 @@
                 <w:bCs/>
                 <w:sz w:val="24"/>
                 <w:szCs w:val="24"/>
-                <w:lang/>
               </w:rPr>
               <w:t>LIME</w:t>
             </w:r>
@@ -1948,14 +1846,12 @@
               <w:rPr>
                 <w:sz w:val="24"/>
                 <w:szCs w:val="24"/>
-                <w:lang/>
               </w:rPr>
             </w:pPr>
             <w:r>
               <w:rPr>
                 <w:sz w:val="24"/>
                 <w:szCs w:val="24"/>
-                <w:lang/>
               </w:rPr>
               <w:t>Faithfulness</w:t>
             </w:r>
@@ -1972,14 +1868,12 @@
               <w:rPr>
                 <w:sz w:val="24"/>
                 <w:szCs w:val="24"/>
-                <w:lang/>
               </w:rPr>
             </w:pPr>
             <w:r>
               <w:rPr>
                 <w:sz w:val="24"/>
                 <w:szCs w:val="24"/>
-                <w:lang/>
               </w:rPr>
               <w:t>High</w:t>
             </w:r>
@@ -1996,14 +1890,12 @@
               <w:rPr>
                 <w:sz w:val="24"/>
                 <w:szCs w:val="24"/>
-                <w:lang/>
               </w:rPr>
             </w:pPr>
             <w:r>
               <w:rPr>
                 <w:sz w:val="24"/>
                 <w:szCs w:val="24"/>
-                <w:lang/>
               </w:rPr>
               <w:t>Medium</w:t>
             </w:r>
@@ -2025,14 +1917,12 @@
               <w:rPr>
                 <w:sz w:val="24"/>
                 <w:szCs w:val="24"/>
-                <w:lang/>
               </w:rPr>
             </w:pPr>
             <w:r>
               <w:rPr>
                 <w:sz w:val="24"/>
                 <w:szCs w:val="24"/>
-                <w:lang/>
               </w:rPr>
               <w:t>Stability</w:t>
             </w:r>
@@ -2049,14 +1939,12 @@
               <w:rPr>
                 <w:sz w:val="24"/>
                 <w:szCs w:val="24"/>
-                <w:lang/>
               </w:rPr>
             </w:pPr>
             <w:r>
               <w:rPr>
                 <w:sz w:val="24"/>
                 <w:szCs w:val="24"/>
-                <w:lang/>
               </w:rPr>
               <w:t>High</w:t>
             </w:r>
@@ -2073,14 +1961,12 @@
               <w:rPr>
                 <w:sz w:val="24"/>
                 <w:szCs w:val="24"/>
-                <w:lang/>
               </w:rPr>
             </w:pPr>
             <w:r>
               <w:rPr>
                 <w:sz w:val="24"/>
                 <w:szCs w:val="24"/>
-                <w:lang/>
               </w:rPr>
               <w:t>Low</w:t>
             </w:r>
@@ -2102,14 +1988,12 @@
               <w:rPr>
                 <w:sz w:val="24"/>
                 <w:szCs w:val="24"/>
-                <w:lang/>
               </w:rPr>
             </w:pPr>
             <w:r>
               <w:rPr>
                 <w:sz w:val="24"/>
                 <w:szCs w:val="24"/>
-                <w:lang/>
               </w:rPr>
               <w:t>Speed</w:t>
             </w:r>
@@ -2126,14 +2010,12 @@
               <w:rPr>
                 <w:sz w:val="24"/>
                 <w:szCs w:val="24"/>
-                <w:lang/>
               </w:rPr>
             </w:pPr>
             <w:r>
               <w:rPr>
                 <w:sz w:val="24"/>
                 <w:szCs w:val="24"/>
-                <w:lang/>
               </w:rPr>
               <w:t>Slow</w:t>
             </w:r>
@@ -2150,14 +2032,12 @@
               <w:rPr>
                 <w:sz w:val="24"/>
                 <w:szCs w:val="24"/>
-                <w:lang/>
               </w:rPr>
             </w:pPr>
             <w:r>
               <w:rPr>
                 <w:sz w:val="24"/>
                 <w:szCs w:val="24"/>
-                <w:lang/>
               </w:rPr>
               <w:t>Fast</w:t>
             </w:r>
@@ -2179,14 +2059,12 @@
               <w:rPr>
                 <w:sz w:val="24"/>
                 <w:szCs w:val="24"/>
-                <w:lang/>
               </w:rPr>
             </w:pPr>
             <w:r>
               <w:rPr>
                 <w:sz w:val="24"/>
                 <w:szCs w:val="24"/>
-                <w:lang/>
               </w:rPr>
               <w:t>Scope</w:t>
             </w:r>
@@ -2203,14 +2081,12 @@
               <w:rPr>
                 <w:sz w:val="24"/>
                 <w:szCs w:val="24"/>
-                <w:lang/>
               </w:rPr>
             </w:pPr>
             <w:r>
               <w:rPr>
                 <w:sz w:val="24"/>
                 <w:szCs w:val="24"/>
-                <w:lang/>
               </w:rPr>
               <w:t>Global + Local</w:t>
             </w:r>
@@ -2227,14 +2103,12 @@
               <w:rPr>
                 <w:sz w:val="24"/>
                 <w:szCs w:val="24"/>
-                <w:lang/>
               </w:rPr>
             </w:pPr>
             <w:r>
               <w:rPr>
                 <w:sz w:val="24"/>
                 <w:szCs w:val="24"/>
-                <w:lang/>
               </w:rPr>
               <w:t>Local only</w:t>
             </w:r>
@@ -2257,7 +2131,6 @@
           <w:bCs/>
           <w:sz w:val="24"/>
           <w:szCs w:val="24"/>
-          <w:lang/>
         </w:rPr>
       </w:pPr>
       <w:r>
@@ -2266,7 +2139,6 @@
           <w:bCs/>
           <w:sz w:val="24"/>
           <w:szCs w:val="24"/>
-          <w:lang/>
         </w:rPr>
         <w:t>9. Error Analysis</w:t>
       </w:r>
@@ -2276,14 +2148,12 @@
         <w:rPr>
           <w:sz w:val="24"/>
           <w:szCs w:val="24"/>
-          <w:lang/>
-        </w:rPr>
-      </w:pPr>
-      <w:r>
-        <w:rPr>
-          <w:sz w:val="24"/>
-          <w:szCs w:val="24"/>
-          <w:lang/>
+        </w:rPr>
+      </w:pPr>
+      <w:r>
+        <w:rPr>
+          <w:sz w:val="24"/>
+          <w:szCs w:val="24"/>
         </w:rPr>
         <w:t>We analyzed misclassified samples.</w:t>
       </w:r>
@@ -2295,7 +2165,6 @@
           <w:bCs/>
           <w:sz w:val="24"/>
           <w:szCs w:val="24"/>
-          <w:lang/>
         </w:rPr>
       </w:pPr>
       <w:r>
@@ -2304,7 +2173,6 @@
           <w:bCs/>
           <w:sz w:val="24"/>
           <w:szCs w:val="24"/>
-          <w:lang/>
         </w:rPr>
         <w:t>Common Issues:</w:t>
       </w:r>
@@ -2318,14 +2186,12 @@
         <w:rPr>
           <w:sz w:val="24"/>
           <w:szCs w:val="24"/>
-          <w:lang/>
-        </w:rPr>
-      </w:pPr>
-      <w:r>
-        <w:rPr>
-          <w:sz w:val="24"/>
-          <w:szCs w:val="24"/>
-          <w:lang/>
+        </w:rPr>
+      </w:pPr>
+      <w:r>
+        <w:rPr>
+          <w:sz w:val="24"/>
+          <w:szCs w:val="24"/>
         </w:rPr>
         <w:t xml:space="preserve">Sarcasm in reviews </w:t>
       </w:r>
@@ -2339,14 +2205,12 @@
         <w:rPr>
           <w:sz w:val="24"/>
           <w:szCs w:val="24"/>
-          <w:lang/>
-        </w:rPr>
-      </w:pPr>
-      <w:r>
-        <w:rPr>
-          <w:sz w:val="24"/>
-          <w:szCs w:val="24"/>
-          <w:lang/>
+        </w:rPr>
+      </w:pPr>
+      <w:r>
+        <w:rPr>
+          <w:sz w:val="24"/>
+          <w:szCs w:val="24"/>
         </w:rPr>
         <w:t xml:space="preserve">Mixed sentiment sentences </w:t>
       </w:r>
@@ -2360,14 +2224,12 @@
         <w:rPr>
           <w:sz w:val="24"/>
           <w:szCs w:val="24"/>
-          <w:lang/>
-        </w:rPr>
-      </w:pPr>
-      <w:r>
-        <w:rPr>
-          <w:sz w:val="24"/>
-          <w:szCs w:val="24"/>
-          <w:lang/>
+        </w:rPr>
+      </w:pPr>
+      <w:r>
+        <w:rPr>
+          <w:sz w:val="24"/>
+          <w:szCs w:val="24"/>
         </w:rPr>
         <w:t xml:space="preserve">Long complex reviews </w:t>
       </w:r>
@@ -2381,36 +2243,473 @@
         <w:rPr>
           <w:sz w:val="24"/>
           <w:szCs w:val="24"/>
+        </w:rPr>
+      </w:pPr>
+      <w:r>
+        <w:rPr>
+          <w:sz w:val="24"/>
+          <w:szCs w:val="24"/>
+        </w:rPr>
+        <w:t xml:space="preserve">Ambiguous wording </w:t>
+      </w:r>
+    </w:p>
+    <w:p>
+      <w:pPr>
+        <w:pStyle w:val="ListParagraph"/>
+        <w:numPr>
+          <w:ilvl w:val="0"/>
+          <w:numId w:val="11"/>
+        </w:numPr>
+        <w:spacing w:after="0" w:line="240" w:lineRule="auto"/>
+        <w:rPr>
+          <w:rFonts w:ascii="Consolas" w:eastAsia="Times New Roman" w:hAnsi="Consolas" w:cs="Times New Roman"/>
+          <w:color w:val="CCCCCC"/>
+          <w:kern w:val="0"/>
+          <w:sz w:val="21"/>
+          <w:szCs w:val="21"/>
           <w:lang/>
-        </w:rPr>
-      </w:pPr>
-      <w:r>
-        <w:rPr>
-          <w:sz w:val="24"/>
-          <w:szCs w:val="24"/>
+          <w14:ligatures w14:val="none"/>
+        </w:rPr>
+      </w:pPr>
+      <w:r>
+        <w:rPr>
+          <w:rFonts w:ascii="Consolas" w:eastAsia="Times New Roman" w:hAnsi="Consolas" w:cs="Times New Roman"/>
+          <w:color w:val="CCCCCC"/>
+          <w:kern w:val="0"/>
+          <w:sz w:val="21"/>
+          <w:szCs w:val="21"/>
           <w:lang/>
-        </w:rPr>
-        <w:lastRenderedPageBreak/>
-        <w:t xml:space="preserve">Ambiguous wording </w:t>
-      </w:r>
-    </w:p>
-    <w:p>
-      <w:pPr>
-        <w:rPr>
-          <w:sz w:val="24"/>
-          <w:szCs w:val="24"/>
+          <w14:ligatures w14:val="none"/>
+        </w:rPr>
+        <w:t>TEXT: Just a heads up. Two of the songs on 1000 Fires are Babble tunes. If you are a Babble fan, then you probably want to check this out....</w:t>
+      </w:r>
+    </w:p>
+    <w:p>
+      <w:pPr>
+        <w:pStyle w:val="ListParagraph"/>
+        <w:numPr>
+          <w:ilvl w:val="0"/>
+          <w:numId w:val="11"/>
+        </w:numPr>
+        <w:spacing w:after="0" w:line="240" w:lineRule="auto"/>
+        <w:rPr>
+          <w:rFonts w:ascii="Consolas" w:eastAsia="Times New Roman" w:hAnsi="Consolas" w:cs="Times New Roman"/>
+          <w:color w:val="CCCCCC"/>
+          <w:kern w:val="0"/>
+          <w:sz w:val="21"/>
+          <w:szCs w:val="21"/>
           <w:lang/>
-        </w:rPr>
-      </w:pPr>
-      <w:r>
-        <w:rPr>
-          <w:sz w:val="24"/>
-          <w:szCs w:val="24"/>
+          <w14:ligatures w14:val="none"/>
+        </w:rPr>
+      </w:pPr>
+      <w:r>
+        <w:rPr>
+          <w:rFonts w:ascii="Consolas" w:eastAsia="Times New Roman" w:hAnsi="Consolas" w:cs="Times New Roman"/>
+          <w:color w:val="CCCCCC"/>
+          <w:kern w:val="0"/>
+          <w:sz w:val="21"/>
+          <w:szCs w:val="21"/>
           <w:lang/>
-        </w:rPr>
-        <w:pict w14:anchorId="360D3F5B">
-          <v:rect id="_x0000_i1103" style="width:0;height:1.5pt" o:hralign="center" o:hrstd="t" o:hr="t" fillcolor="#a0a0a0" stroked="f"/>
-        </w:pict>
+          <w14:ligatures w14:val="none"/>
+        </w:rPr>
+        <w:t>TRUE: 1</w:t>
+      </w:r>
+    </w:p>
+    <w:p>
+      <w:pPr>
+        <w:pStyle w:val="ListParagraph"/>
+        <w:numPr>
+          <w:ilvl w:val="0"/>
+          <w:numId w:val="11"/>
+        </w:numPr>
+        <w:spacing w:after="0" w:line="240" w:lineRule="auto"/>
+        <w:rPr>
+          <w:rFonts w:ascii="Consolas" w:eastAsia="Times New Roman" w:hAnsi="Consolas" w:cs="Times New Roman"/>
+          <w:color w:val="CCCCCC"/>
+          <w:kern w:val="0"/>
+          <w:sz w:val="21"/>
+          <w:szCs w:val="21"/>
+          <w:lang/>
+          <w14:ligatures w14:val="none"/>
+        </w:rPr>
+      </w:pPr>
+      <w:r>
+        <w:rPr>
+          <w:rFonts w:ascii="Consolas" w:eastAsia="Times New Roman" w:hAnsi="Consolas" w:cs="Times New Roman"/>
+          <w:color w:val="CCCCCC"/>
+          <w:kern w:val="0"/>
+          <w:sz w:val="21"/>
+          <w:szCs w:val="21"/>
+          <w:lang/>
+          <w14:ligatures w14:val="none"/>
+        </w:rPr>
+        <w:t>PRED: 0</w:t>
+      </w:r>
+    </w:p>
+    <w:p>
+      <w:pPr>
+        <w:pStyle w:val="ListParagraph"/>
+        <w:numPr>
+          <w:ilvl w:val="0"/>
+          <w:numId w:val="11"/>
+        </w:numPr>
+        <w:spacing w:after="0" w:line="240" w:lineRule="auto"/>
+        <w:rPr>
+          <w:rFonts w:ascii="Consolas" w:eastAsia="Times New Roman" w:hAnsi="Consolas" w:cs="Times New Roman"/>
+          <w:color w:val="CCCCCC"/>
+          <w:kern w:val="0"/>
+          <w:sz w:val="21"/>
+          <w:szCs w:val="21"/>
+          <w:lang/>
+          <w14:ligatures w14:val="none"/>
+        </w:rPr>
+      </w:pPr>
+      <w:r>
+        <w:rPr>
+          <w:rFonts w:ascii="Consolas" w:eastAsia="Times New Roman" w:hAnsi="Consolas" w:cs="Times New Roman"/>
+          <w:color w:val="CCCCCC"/>
+          <w:kern w:val="0"/>
+          <w:sz w:val="21"/>
+          <w:szCs w:val="21"/>
+          <w:lang/>
+          <w14:ligatures w14:val="none"/>
+        </w:rPr>
+        <w:t>CONFIDENCE: tensor([0.6519, 0.3481])</w:t>
+      </w:r>
+    </w:p>
+    <w:p>
+      <w:pPr>
+        <w:pStyle w:val="ListParagraph"/>
+        <w:numPr>
+          <w:ilvl w:val="0"/>
+          <w:numId w:val="11"/>
+        </w:numPr>
+        <w:spacing w:after="0" w:line="240" w:lineRule="auto"/>
+        <w:rPr>
+          <w:rFonts w:ascii="Consolas" w:eastAsia="Times New Roman" w:hAnsi="Consolas" w:cs="Times New Roman"/>
+          <w:color w:val="CCCCCC"/>
+          <w:kern w:val="0"/>
+          <w:sz w:val="21"/>
+          <w:szCs w:val="21"/>
+          <w:lang/>
+          <w14:ligatures w14:val="none"/>
+        </w:rPr>
+      </w:pPr>
+      <w:r>
+        <w:rPr>
+          <w:rFonts w:ascii="Consolas" w:eastAsia="Times New Roman" w:hAnsi="Consolas" w:cs="Times New Roman"/>
+          <w:color w:val="CCCCCC"/>
+          <w:kern w:val="0"/>
+          <w:sz w:val="21"/>
+          <w:szCs w:val="21"/>
+          <w:lang/>
+          <w14:ligatures w14:val="none"/>
+        </w:rPr>
+        <w:t>------------------------------------------------------------</w:t>
+      </w:r>
+    </w:p>
+    <w:p>
+      <w:pPr>
+        <w:pStyle w:val="ListParagraph"/>
+        <w:numPr>
+          <w:ilvl w:val="0"/>
+          <w:numId w:val="11"/>
+        </w:numPr>
+        <w:spacing w:after="0" w:line="240" w:lineRule="auto"/>
+        <w:rPr>
+          <w:rFonts w:ascii="Consolas" w:eastAsia="Times New Roman" w:hAnsi="Consolas" w:cs="Times New Roman"/>
+          <w:color w:val="CCCCCC"/>
+          <w:kern w:val="0"/>
+          <w:sz w:val="21"/>
+          <w:szCs w:val="21"/>
+          <w:lang/>
+          <w14:ligatures w14:val="none"/>
+        </w:rPr>
+      </w:pPr>
+      <w:r>
+        <w:rPr>
+          <w:rFonts w:ascii="Consolas" w:eastAsia="Times New Roman" w:hAnsi="Consolas" w:cs="Times New Roman"/>
+          <w:color w:val="CCCCCC"/>
+          <w:kern w:val="0"/>
+          <w:sz w:val="21"/>
+          <w:szCs w:val="21"/>
+          <w:lang/>
+          <w14:ligatures w14:val="none"/>
+        </w:rPr>
+        <w:t>TEXT: My five year old loves his voice changer. In fact everyone in the house plays with it. I like how you can use multiple switches to make even more that 10 different effects. Fun, but if you have a head</w:t>
+      </w:r>
+    </w:p>
+    <w:p>
+      <w:pPr>
+        <w:pStyle w:val="ListParagraph"/>
+        <w:numPr>
+          <w:ilvl w:val="0"/>
+          <w:numId w:val="11"/>
+        </w:numPr>
+        <w:spacing w:after="0" w:line="240" w:lineRule="auto"/>
+        <w:rPr>
+          <w:rFonts w:ascii="Consolas" w:eastAsia="Times New Roman" w:hAnsi="Consolas" w:cs="Times New Roman"/>
+          <w:color w:val="CCCCCC"/>
+          <w:kern w:val="0"/>
+          <w:sz w:val="21"/>
+          <w:szCs w:val="21"/>
+          <w:lang/>
+          <w14:ligatures w14:val="none"/>
+        </w:rPr>
+      </w:pPr>
+      <w:r>
+        <w:rPr>
+          <w:rFonts w:ascii="Consolas" w:eastAsia="Times New Roman" w:hAnsi="Consolas" w:cs="Times New Roman"/>
+          <w:color w:val="CCCCCC"/>
+          <w:kern w:val="0"/>
+          <w:sz w:val="21"/>
+          <w:szCs w:val="21"/>
+          <w:lang/>
+          <w14:ligatures w14:val="none"/>
+        </w:rPr>
+        <w:t>TRUE: 1</w:t>
+      </w:r>
+    </w:p>
+    <w:p>
+      <w:pPr>
+        <w:pStyle w:val="ListParagraph"/>
+        <w:numPr>
+          <w:ilvl w:val="0"/>
+          <w:numId w:val="11"/>
+        </w:numPr>
+        <w:spacing w:after="0" w:line="240" w:lineRule="auto"/>
+        <w:rPr>
+          <w:rFonts w:ascii="Consolas" w:eastAsia="Times New Roman" w:hAnsi="Consolas" w:cs="Times New Roman"/>
+          <w:color w:val="CCCCCC"/>
+          <w:kern w:val="0"/>
+          <w:sz w:val="21"/>
+          <w:szCs w:val="21"/>
+          <w:lang/>
+          <w14:ligatures w14:val="none"/>
+        </w:rPr>
+      </w:pPr>
+      <w:r>
+        <w:rPr>
+          <w:rFonts w:ascii="Consolas" w:eastAsia="Times New Roman" w:hAnsi="Consolas" w:cs="Times New Roman"/>
+          <w:color w:val="CCCCCC"/>
+          <w:kern w:val="0"/>
+          <w:sz w:val="21"/>
+          <w:szCs w:val="21"/>
+          <w:lang/>
+          <w14:ligatures w14:val="none"/>
+        </w:rPr>
+        <w:t>PRED: 0</w:t>
+      </w:r>
+    </w:p>
+    <w:p>
+      <w:pPr>
+        <w:pStyle w:val="ListParagraph"/>
+        <w:numPr>
+          <w:ilvl w:val="0"/>
+          <w:numId w:val="11"/>
+        </w:numPr>
+        <w:spacing w:after="0" w:line="240" w:lineRule="auto"/>
+        <w:rPr>
+          <w:rFonts w:ascii="Consolas" w:eastAsia="Times New Roman" w:hAnsi="Consolas" w:cs="Times New Roman"/>
+          <w:color w:val="CCCCCC"/>
+          <w:kern w:val="0"/>
+          <w:sz w:val="21"/>
+          <w:szCs w:val="21"/>
+          <w:lang/>
+          <w14:ligatures w14:val="none"/>
+        </w:rPr>
+      </w:pPr>
+      <w:r>
+        <w:rPr>
+          <w:rFonts w:ascii="Consolas" w:eastAsia="Times New Roman" w:hAnsi="Consolas" w:cs="Times New Roman"/>
+          <w:color w:val="CCCCCC"/>
+          <w:kern w:val="0"/>
+          <w:sz w:val="21"/>
+          <w:szCs w:val="21"/>
+          <w:lang/>
+          <w14:ligatures w14:val="none"/>
+        </w:rPr>
+        <w:t>CONFIDENCE: tensor([0.7544, 0.2456])</w:t>
+      </w:r>
+    </w:p>
+    <w:p>
+      <w:pPr>
+        <w:pStyle w:val="ListParagraph"/>
+        <w:numPr>
+          <w:ilvl w:val="0"/>
+          <w:numId w:val="11"/>
+        </w:numPr>
+        <w:spacing w:after="0" w:line="240" w:lineRule="auto"/>
+        <w:rPr>
+          <w:rFonts w:ascii="Consolas" w:eastAsia="Times New Roman" w:hAnsi="Consolas" w:cs="Times New Roman"/>
+          <w:color w:val="CCCCCC"/>
+          <w:kern w:val="0"/>
+          <w:sz w:val="21"/>
+          <w:szCs w:val="21"/>
+          <w:lang/>
+          <w14:ligatures w14:val="none"/>
+        </w:rPr>
+      </w:pPr>
+      <w:r>
+        <w:rPr>
+          <w:rFonts w:ascii="Consolas" w:eastAsia="Times New Roman" w:hAnsi="Consolas" w:cs="Times New Roman"/>
+          <w:color w:val="CCCCCC"/>
+          <w:kern w:val="0"/>
+          <w:sz w:val="21"/>
+          <w:szCs w:val="21"/>
+          <w:lang/>
+          <w14:ligatures w14:val="none"/>
+        </w:rPr>
+        <w:t>------------------------------------------------------------</w:t>
+      </w:r>
+    </w:p>
+    <w:p>
+      <w:pPr>
+        <w:pStyle w:val="ListParagraph"/>
+        <w:numPr>
+          <w:ilvl w:val="0"/>
+          <w:numId w:val="11"/>
+        </w:numPr>
+        <w:spacing w:after="0" w:line="240" w:lineRule="auto"/>
+        <w:rPr>
+          <w:rFonts w:ascii="Consolas" w:eastAsia="Times New Roman" w:hAnsi="Consolas" w:cs="Times New Roman"/>
+          <w:color w:val="CCCCCC"/>
+          <w:kern w:val="0"/>
+          <w:sz w:val="21"/>
+          <w:szCs w:val="21"/>
+          <w:lang/>
+          <w14:ligatures w14:val="none"/>
+        </w:rPr>
+      </w:pPr>
+      <w:r>
+        <w:rPr>
+          <w:rFonts w:ascii="Consolas" w:eastAsia="Times New Roman" w:hAnsi="Consolas" w:cs="Times New Roman"/>
+          <w:color w:val="CCCCCC"/>
+          <w:kern w:val="0"/>
+          <w:sz w:val="21"/>
+          <w:szCs w:val="21"/>
+          <w:lang/>
+          <w14:ligatures w14:val="none"/>
+        </w:rPr>
+        <w:t xml:space="preserve">TEXT: Prospective buyers, beware!I did a lot of research, and finally settled on the Creative Zen Vision:M. I was certainly impressed when it arrived, it is handsome and the player itself is easy to figure </w:t>
+      </w:r>
+    </w:p>
+    <w:p>
+      <w:pPr>
+        <w:pStyle w:val="ListParagraph"/>
+        <w:numPr>
+          <w:ilvl w:val="0"/>
+          <w:numId w:val="11"/>
+        </w:numPr>
+        <w:spacing w:after="0" w:line="240" w:lineRule="auto"/>
+        <w:rPr>
+          <w:rFonts w:ascii="Consolas" w:eastAsia="Times New Roman" w:hAnsi="Consolas" w:cs="Times New Roman"/>
+          <w:color w:val="CCCCCC"/>
+          <w:kern w:val="0"/>
+          <w:sz w:val="21"/>
+          <w:szCs w:val="21"/>
+          <w:lang/>
+          <w14:ligatures w14:val="none"/>
+        </w:rPr>
+      </w:pPr>
+      <w:r>
+        <w:rPr>
+          <w:rFonts w:ascii="Consolas" w:eastAsia="Times New Roman" w:hAnsi="Consolas" w:cs="Times New Roman"/>
+          <w:color w:val="CCCCCC"/>
+          <w:kern w:val="0"/>
+          <w:sz w:val="21"/>
+          <w:szCs w:val="21"/>
+          <w:lang/>
+          <w14:ligatures w14:val="none"/>
+        </w:rPr>
+        <w:t>TRUE: 0</w:t>
+      </w:r>
+    </w:p>
+    <w:p>
+      <w:pPr>
+        <w:pStyle w:val="ListParagraph"/>
+        <w:numPr>
+          <w:ilvl w:val="0"/>
+          <w:numId w:val="11"/>
+        </w:numPr>
+        <w:spacing w:after="0" w:line="240" w:lineRule="auto"/>
+        <w:rPr>
+          <w:rFonts w:ascii="Consolas" w:eastAsia="Times New Roman" w:hAnsi="Consolas" w:cs="Times New Roman"/>
+          <w:color w:val="CCCCCC"/>
+          <w:kern w:val="0"/>
+          <w:sz w:val="21"/>
+          <w:szCs w:val="21"/>
+          <w:lang/>
+          <w14:ligatures w14:val="none"/>
+        </w:rPr>
+      </w:pPr>
+      <w:r>
+        <w:rPr>
+          <w:rFonts w:ascii="Consolas" w:eastAsia="Times New Roman" w:hAnsi="Consolas" w:cs="Times New Roman"/>
+          <w:color w:val="CCCCCC"/>
+          <w:kern w:val="0"/>
+          <w:sz w:val="21"/>
+          <w:szCs w:val="21"/>
+          <w:lang/>
+          <w14:ligatures w14:val="none"/>
+        </w:rPr>
+        <w:t>PRED: 1</w:t>
+      </w:r>
+    </w:p>
+    <w:p>
+      <w:pPr>
+        <w:pStyle w:val="ListParagraph"/>
+        <w:numPr>
+          <w:ilvl w:val="0"/>
+          <w:numId w:val="11"/>
+        </w:numPr>
+        <w:spacing w:after="0" w:line="240" w:lineRule="auto"/>
+        <w:rPr>
+          <w:rFonts w:ascii="Consolas" w:eastAsia="Times New Roman" w:hAnsi="Consolas" w:cs="Times New Roman"/>
+          <w:color w:val="CCCCCC"/>
+          <w:kern w:val="0"/>
+          <w:sz w:val="21"/>
+          <w:szCs w:val="21"/>
+          <w:lang/>
+          <w14:ligatures w14:val="none"/>
+        </w:rPr>
+      </w:pPr>
+      <w:r>
+        <w:rPr>
+          <w:rFonts w:ascii="Consolas" w:eastAsia="Times New Roman" w:hAnsi="Consolas" w:cs="Times New Roman"/>
+          <w:color w:val="CCCCCC"/>
+          <w:kern w:val="0"/>
+          <w:sz w:val="21"/>
+          <w:szCs w:val="21"/>
+          <w:lang/>
+          <w14:ligatures w14:val="none"/>
+        </w:rPr>
+        <w:t>CONFIDENCE: tensor([0.1603, 0.8397])</w:t>
+      </w:r>
+    </w:p>
+    <w:p>
+      <w:pPr>
+        <w:pStyle w:val="ListParagraph"/>
+        <w:numPr>
+          <w:ilvl w:val="0"/>
+          <w:numId w:val="11"/>
+        </w:numPr>
+        <w:rPr>
+          <w:sz w:val="24"/>
+          <w:szCs w:val="24"/>
+        </w:rPr>
+      </w:pPr>
+      <w:r>
+        <w:rPr>
+          <w:rFonts w:ascii="Consolas" w:eastAsia="Times New Roman" w:hAnsi="Consolas" w:cs="Times New Roman"/>
+          <w:color w:val="CCCCCC"/>
+          <w:kern w:val="0"/>
+          <w:sz w:val="21"/>
+          <w:szCs w:val="21"/>
+          <w:lang/>
+          <w14:ligatures w14:val="none"/>
+        </w:rPr>
+        <w:t>------------------------------------------------------------</w:t>
       </w:r>
     </w:p>
     <w:p>
@@ -2420,16 +2719,24 @@
           <w:bCs/>
           <w:sz w:val="24"/>
           <w:szCs w:val="24"/>
-          <w:lang/>
-        </w:rPr>
-      </w:pPr>
-      <w:r>
+        </w:rPr>
+      </w:pPr>
+    </w:p>
+    <w:p>
+      <w:pPr>
         <w:rPr>
           <w:b/>
           <w:bCs/>
           <w:sz w:val="24"/>
           <w:szCs w:val="24"/>
-          <w:lang/>
+        </w:rPr>
+      </w:pPr>
+      <w:r>
+        <w:rPr>
+          <w:b/>
+          <w:bCs/>
+          <w:sz w:val="24"/>
+          <w:szCs w:val="24"/>
         </w:rPr>
         <w:t>10. Conclusion</w:t>
       </w:r>
@@ -2439,14 +2746,12 @@
         <w:rPr>
           <w:sz w:val="24"/>
           <w:szCs w:val="24"/>
-          <w:lang/>
-        </w:rPr>
-      </w:pPr>
-      <w:r>
-        <w:rPr>
-          <w:sz w:val="24"/>
-          <w:szCs w:val="24"/>
-          <w:lang/>
+        </w:rPr>
+      </w:pPr>
+      <w:r>
+        <w:rPr>
+          <w:sz w:val="24"/>
+          <w:szCs w:val="24"/>
         </w:rPr>
         <w:t>This project demonstrates the effectiveness of Transformer-based models in sentiment analysis. Beyond performance, explainability techniques such as SHAP and LIME provide valuable insights into model decisions.</w:t>
       </w:r>
@@ -2456,14 +2761,12 @@
         <w:rPr>
           <w:sz w:val="24"/>
           <w:szCs w:val="24"/>
-          <w:lang/>
-        </w:rPr>
-      </w:pPr>
-      <w:r>
-        <w:rPr>
-          <w:sz w:val="24"/>
-          <w:szCs w:val="24"/>
-          <w:lang/>
+        </w:rPr>
+      </w:pPr>
+      <w:r>
+        <w:rPr>
+          <w:sz w:val="24"/>
+          <w:szCs w:val="24"/>
         </w:rPr>
         <w:t>Attention visualization further helps understand how the model processes text.</w:t>
       </w:r>
@@ -4706,6 +5009,7 @@
   <w:style w:type="character" w:default="1" w:styleId="DefaultParagraphFont">
     <w:name w:val="Default Paragraph Font"/>
     <w:uiPriority w:val="1"/>
+    <w:semiHidden/>
     <w:unhideWhenUsed/>
   </w:style>
   <w:style w:type="table" w:default="1" w:styleId="TableNormal">

</xml_diff>